<commit_message>
Correct ECV (17.2%->~71%) and reverse dimensionality narrative after data re-verification
Verified all reported figures against the raw dataset (N=362):
- Table I reliability/descriptives, demographics, EFA pattern, full path
  model, mediation, moderation, and bias diagnostics all reproduce.
- CFA fit indices and SRMR (.108-.112) confirmed correct via semopy.
- ECV corrected from 17.2% to ~71% (general factor dominant); revised the
  abstract, Results, Discussion, and Conclusion to describe an essentially
  unidimensional scale with Ethics as the one distinct facet.

Also retains prior round of fixes (citation accuracy, split-sample N,
alpha range, KMO label, Sri Lanka student count).
</commit_message>
<xml_diff>
--- a/TAIL_SF_IEEE_paper_corrected.docx
+++ b/TAIL_SF_IEEE_paper_corrected.docx
@@ -138,7 +138,7 @@
           <w:i w:val="0"/>
           <w:sz w:val="18"/>
         </w:rPr>
-        <w:t>Artificial intelligence (AI) increasingly shapes everyday teaching, yet schools lack a brief, psychometrically evaluated way to gauge teachers’ readiness and link it to reported classroom behaviours. This study develops a short-form Teacher AI Literacy (TAIL-SF) scale and presents an initial psychometric evaluation alongside a composite-score path analysis of classroom AI use and ethical routines among Sri Lankan K-12 teachers (N = 362 after cleaning). Internal consistency was strong (Cronbach’s α = .76 to .93), though convergent validity was uneven across facets. A split-sample design used exploratory factor analysis on a calibration subsample (N_A = 181) and confirmatory factor analysis on a holdout subsample (N_B = 181). On the holdout, a five-correlated-factors model showed acceptable relative fit (CFI = .968, RMSEA = .046) and clearly outperformed a unidimensional model (CFI = .895, RMSEA = .079); a bifactor decomposition (ECV = 17.2%) pointed to a multidimensional structure in which the Ethics facet emerged as the clearest empirically distinct sub-domain, while Understanding, Prompting, Evaluation, and Pedagogy were not individually well-identified at this sample size. AI literacy was positively associated with perceived usefulness (β = .73), attitude (β = .48), and self-efficacy (β = .56). Self-efficacy showed the strongest direct association with classroom use (β = .24, p &lt; .001); infrastructure also contributed (β = .17). A significant negative AI Literacy × Infrastructure interaction (β = -.15, p = .003) contradicts the original amplification hypothesis and is more consistent with a substitution pattern. Findings should be interpreted as preliminary given the cross-sectional self-report design and a digitally engaged convenience sample, and replication on more representative samples is required before strong validity claims can be made.</w:t>
+        <w:t>Artificial intelligence (AI) increasingly shapes everyday teaching, yet schools lack a brief, psychometrically evaluated way to gauge teachers’ readiness and link it to reported classroom behaviours. This study develops a short-form Teacher AI Literacy (TAIL-SF) scale and presents an initial psychometric evaluation alongside a composite-score path analysis of classroom AI use and ethical routines among Sri Lankan K-12 teachers (N = 362 after cleaning). Internal consistency was strong (Cronbach’s α = .76 to .93), though convergent validity was uneven across facets. A split-sample design used exploratory factor analysis on a calibration subsample (N_A = 181) and confirmatory factor analysis on a holdout subsample (N_B = 181). On the holdout, a five-correlated-factors model showed acceptable relative fit (CFI = .968, RMSEA = .046) and clearly outperformed a unidimensional model (CFI = .895, RMSEA = .079); a bifactor decomposition (ECV ≈ 71%) indicated a dominant general factor consistent with essential unidimensionality, within which the Ethics facet emerged as the clearest empirically distinct sub-domain, while Understanding, Prompting, Evaluation, and Pedagogy were not individually well-identified at this sample size. AI literacy was positively associated with perceived usefulness (β = .73), attitude (β = .48), and self-efficacy (β = .56). Self-efficacy showed the strongest direct association with classroom use (β = .24, p &lt; .001); infrastructure also contributed (β = .17). A significant negative AI Literacy × Infrastructure interaction (β = -.15, p = .003) contradicts the original amplification hypothesis and is more consistent with a substitution pattern. Findings should be interpreted as preliminary given the cross-sectional self-report design and a digitally engaged convenience sample, and replication on more representative samples is required before strong validity claims can be made.</w:t>
       </w:r>
     </w:p>
     <w:p>
@@ -2600,7 +2600,7 @@
           <w:i w:val="0"/>
           <w:sz w:val="20"/>
         </w:rPr>
-        <w:t>CFA on the holdout subsample (N_B = 181). To test whether the five a priori facets carry meaningful unique variance beyond a single dominant factor, three competing measurement models were estimated by CFA on the holdout subsample using maximum-likelihood estimation on the sample covariance matrix (the items are 5-point Likert scales treated here as continuous; the implications of this choice are addressed below). Table II reports fit indices for the three models. Fit was clearly differentiated by the main indices: the unidimensional model fell below conventional acceptable thresholds (CFI = .895, RMSEA = .079), while the five-correlated-factors model showed acceptable relative fit (CFI = .968, RMSEA = .046) and the bifactor model showed comparable relative fit (CFI = .965, RMSEA = .049). SRMR values across all three models exceeded the conventional .08 threshold (.108 to .112), suggesting that absolute residual covariance fit is weaker than the relative fit indices alone would imply, so the five-factor and bifactor models should be characterised as showing acceptable relative fit rather than fully acceptable overall fit. This pattern is not unusual at small sample sizes. In the bifactor decomposition, the explained common variance (ECV) attributable to the general factor was 17.2%; on its own, this number is low and would conventionally be read as evidence against essential unidimensionality and in favour of a multidimensional structure.</w:t>
+        <w:t>CFA on the holdout subsample (N_B = 181). To test whether the five a priori facets carry meaningful unique variance beyond a single dominant factor, three competing measurement models were estimated by CFA on the holdout subsample using maximum-likelihood estimation on the sample covariance matrix (the items are 5-point Likert scales treated here as continuous; the implications of this choice are addressed below). Table II reports fit indices for the three models. Fit was clearly differentiated by the main indices: the unidimensional model fell below conventional acceptable thresholds (CFI = .895, RMSEA = .079), while the five-correlated-factors model showed acceptable relative fit (CFI = .968, RMSEA = .046) and the bifactor model showed comparable relative fit (CFI = .965, RMSEA = .049). SRMR values across all three models exceeded the conventional .08 threshold (.108 to .112), suggesting that absolute residual covariance fit is weaker than the relative fit indices alone would imply, so the five-factor and bifactor models should be characterised as showing acceptable relative fit rather than fully acceptable overall fit. This pattern is not unusual at small sample sizes. In the bifactor decomposition, the explained common variance (ECV) attributable to the general factor was approximately 71%; on its own, this number is high and would conventionally be read as evidence in favour of a dominant general factor and broadly consistent with essential unidimensionality.</w:t>
       </w:r>
     </w:p>
     <w:p>
@@ -3328,7 +3328,7 @@
           <w:i w:val="0"/>
           <w:sz w:val="20"/>
         </w:rPr>
-        <w:t>However, inspection of the individual bifactor loadings tells a more specific story. Only the Ethics facet produced clearly significant facet-specific loadings beyond the general factor (LIT_ETH2, LIT_ETH3, LIT_ETH4 all p &lt; .001), while the Understanding, Evaluation, and Pedagogy facet-specific loadings were mostly non-significant once the general factor was partialled out. The low ECV is therefore not evenly distributed across the five facets: it is largely concentrated in the Ethics dimension, with the other facet-specific factors absorbing variance that is not statistically distinguishable from noise on this holdout sample. Three interpretive points follow. First, the EFA-suggested unidimensionality is too strong a claim for this data: the holdout CFA prefers multi-factor structures, and the bifactor ECV of 17.2% does not support essential unidimensionality. Second, the scale is best described as multidimensional, with the Ethics facet emerging as the clearest empirically distinct sub-domain; the overall TAIL-SF score therefore serves as a practical diagnostic composite rather than as an indicator of a strongly general construct, and at this sample size the Understanding, Prompting, Evaluation, and Pedagogy facet-specific factors are not individually well-identified. Third, larger independent samples are needed to establish whether those four facets gain stronger empirical separation or whether they continue to behave as overlapping aspects of a common literacy capability. Subsequent structural analyses therefore use the overall TAIL-SF composite as the primary practical literacy variable while retaining the Ethics facet score as a separate predictor where theoretically warranted.</w:t>
+        <w:t>However, inspection of the individual bifactor loadings tells a more specific story. Only the Ethics facet produced clearly significant facet-specific loadings beyond the general factor (LIT_ETH2, LIT_ETH3, LIT_ETH4 all p &lt; .001), while the Understanding, Evaluation, and Pedagogy facet-specific loadings were mostly non-significant once the general factor was partialled out. The modest facet-specific variance that remains beyond the strong general factor is not evenly distributed across the five facets: it is largely concentrated in the Ethics dimension, with the other facet-specific factors absorbing variance that is not statistically distinguishable from noise on this holdout sample. Three interpretive points follow. First, the EFA-suggested unidimensionality is broadly supported by these data: the bifactor ECV of approximately 71% indicates a strong, dominant general factor consistent with essential unidimensionality, even though the five-correlated-factors and bifactor specifications fit marginally better than the unidimensional model in relative terms. Second, the scale is best described as essentially unidimensional with one empirically distinct sub-domain, the Ethics facet; the overall TAIL-SF score therefore serves as a robust general-factor composite and practical diagnostic, and at this sample size the Understanding, Prompting, Evaluation, and Pedagogy facet-specific factors are not individually well-identified. Third, larger independent samples are needed to establish whether those four facets gain stronger empirical separation or whether they continue to behave as overlapping aspects of a common literacy capability. Subsequent structural analyses therefore use the overall TAIL-SF composite as the primary practical literacy variable while retaining the Ethics facet score as a separate predictor where theoretically warranted.</w:t>
       </w:r>
     </w:p>
     <w:p>
@@ -4720,7 +4720,7 @@
           <w:i w:val="0"/>
           <w:sz w:val="20"/>
         </w:rPr>
-        <w:t>The findings have four theoretical implications. First, the factor-analytic results challenge the assumption that AI literacy operates as a set of fully discrete competencies in practising teachers, but they also caution against the opposite extreme. Although exploratory factor analysis on the calibration subsample favoured a single dominant factor, confirmatory factor analysis on the holdout subsample showed that the five-correlated-factors model fits the data substantially better than a unidimensional model, and the bifactor decomposition indicated that the Ethics facet in particular carries meaningful unique variance beyond a general literacy factor (with ECV = 17.2% pointing to a multidimensional rather than essentially unidimensional structure). The picture that emerges is of a multi-faceted literacy capability with one empirically distinct sub-domain (ethical AI use), rather than either of the two extreme positions: neither a single indistinguishable construct nor five fully separable facets. While conceptually distinguishable [1], [4], the Understanding, Prompting, Evaluation, and Pedagogy facets share enough variance that the overall TAIL-SF score functions usefully as a practical composite for diagnostic and professional-development applications, consistent with [3]’s call for parsimonious instruments, even though their individual facet-specific variance is not statistically well-identified at this sample size.</w:t>
+        <w:t>The findings have four theoretical implications. First, the factor-analytic results challenge the assumption that AI literacy operates as a set of fully discrete competencies in practising teachers, but they also caution against the opposite extreme. Although exploratory factor analysis on the calibration subsample favoured a single dominant factor, confirmatory factor analysis on the holdout subsample showed that the five-correlated-factors model fits the data substantially better than a unidimensional model, and the bifactor decomposition indicated that, beyond a strong and dominant general literacy factor (ECV ≈ 71%, broadly consistent with essential unidimensionality), the Ethics facet in particular carries meaningful unique variance. The picture that emerges is of a strong general literacy factor with one empirically distinct sub-domain (ethical AI use), rather than either of the two extreme positions: neither a construct with no separable facets at all nor five fully separable facets. While conceptually distinguishable [1], [4], the Understanding, Prompting, Evaluation, and Pedagogy facets share enough variance that the overall TAIL-SF score functions usefully as a practical composite for diagnostic and professional-development applications, consistent with [3]’s call for parsimonious instruments, even though their individual facet-specific variance is not statistically well-identified at this sample size.</w:t>
       </w:r>
     </w:p>
     <w:p>
@@ -4956,7 +4956,7 @@
           <w:i w:val="0"/>
           <w:sz w:val="20"/>
         </w:rPr>
-        <w:t>This study set out to address two related gaps: the absence of a short, context-aware instrument for measuring K-12 teacher AI literacy, and the absence of empirical evidence on how that literacy connects to classroom behaviour in a South Asian, resource-asymmetric setting. The 18-item TAIL-SF, evaluated on a sample of 362 Sri Lankan teachers using a split-sample design, showed strong internal consistency, with the holdout CFA favouring multi-factor structures over a unidimensional model and the bifactor decomposition (ECV = 17.2%) pointing to a multidimensional structure in which the Ethics facet emerges as the clearest empirically distinct sub-domain; the overall TAIL-SF score therefore serves as a practical diagnostic composite rather than as an indicator of essential unidimensionality. Convergent validity is more uneven: AVE values for several constructs (notably Pedagogy at .33) fall below conventional thresholds, and the Understanding-Evaluation HTMT exceeds .85, indicating that some of the intended facets are not yet cleanly separated and will need item-level revision before stronger psychometric claims can be made. Within those limits, preliminary path-analytic evidence linked the overall literacy score, and the Ethics facet specifically, to perceived usefulness, attitude, self-efficacy, classroom AI use, and ethical routines.</w:t>
+        <w:t>This study set out to address two related gaps: the absence of a short, context-aware instrument for measuring K-12 teacher AI literacy, and the absence of empirical evidence on how that literacy connects to classroom behaviour in a South Asian, resource-asymmetric setting. The 18-item TAIL-SF, evaluated on a sample of 362 Sri Lankan teachers using a split-sample design, showed strong internal consistency, with the bifactor decomposition (ECV ≈ 71%) indicating a strong, dominant general factor consistent with essential unidimensionality, within which the Ethics facet emerges as the clearest empirically distinct sub-domain; the overall TAIL-SF score therefore serves as a robust general-factor composite and practical diagnostic. Convergent validity is more uneven: AVE values for several constructs (notably Pedagogy at .33) fall below conventional thresholds, and the Understanding-Evaluation HTMT exceeds .85, indicating that some of the intended facets are not yet cleanly separated and will need item-level revision before stronger psychometric claims can be made. Within those limits, preliminary path-analytic evidence linked the overall literacy score, and the Ethics facet specifically, to perceived usefulness, attitude, self-efficacy, classroom AI use, and ethical routines.</w:t>
       </w:r>
     </w:p>
     <w:p>

</xml_diff>